<commit_message>
fix: sync final memory and official financial model
</commit_message>
<xml_diff>
--- a/deliverables/PIE_PLUS_V5.6.2_DEFENSA/docs/CASTUO_SYSTEM_Plan_Empresa_PIE_PLUS_2026_MEMORIA_V5.6.2_EVIDENCIA_EXTERNA.docx
+++ b/deliverables/PIE_PLUS_V5.6.2_DEFENSA/docs/CASTUO_SYSTEM_Plan_Empresa_PIE_PLUS_2026_MEMORIA_V5.6.2_EVIDENCIA_EXTERNA.docx
@@ -44499,7 +44499,7 @@
         <w:pStyle w:val="23"/>
       </w:pPr>
       <w:r>
-        <w:t>Nota de auditoría financiera (v5.6). Correcciones aplicadas para representar la situación real con honestidad: (1) caja propia inicial 0 € (eliminado el antiguo «70.000 € recursos propios» y «95.000 € deuda disponible»); (2) ayudas 18.000 € + ≈2.700 € en trámite, no computadas como caja; (3) los 180.000 € de F1 central son necesidad de financiación a captar; el Excel incorpora este importe únicamente como escenario financiero sujeto a formalización y desembolso documental; (4) RCN 420.000 € separado de caja, financiación e ingresos, y sin capital social ficticio (retirada la aportación en especie del balance hasta su formalización) — esto corrige además la amortización, que pasa de un erróneo 90.000 € (base I+D inflada a 450.000 €) a 9.746,07 €/año (I+D 30.000 × 20 % + aplicaciones 47.250 × 10 % + marca 210,72 × 10 %); (5) el flujo de caja del Excel se presenta como escenario proforma condicionado a concesión y desembolso de 180.000 €; la situación documental real mantiene financiación cobrada = 0 € y caja propia inicial = 0 €; (6) gasto histórico 1.058,31 € + 21,42 USD (incluida la tasa de marca 210,72 € en proceso), separado del presupuesto de F1; (7) envolvente CAPEX futura única prudente 5,14 / central 6,26 / techo 7,46 M€ (sin rangos paralelos).</w:t>
+        <w:t>Nota de auditoría financiera (v5.6). Correcciones aplicadas para representar la situación real con honestidad: (1) caja propia inicial 0 € (eliminado el antiguo «70.000 € recursos propios» y «95.000 € deuda disponible»); (2) ayudas 18.000 € + ≈2.700 € en trámite, no computadas como caja; (3) los 180.000 € de F1 central son necesidad de financiación a captar; el Excel incorpora este importe únicamente como escenario financiero sujeto a formalización y desembolso documental; (4) RCN 420.000 € separado de caja, financiación e ingresos, y sin capital social ficticio (retirada la aportación en especie del balance hasta su formalización) — esto corrige además la amortización, que pasa de un erróneo 90.000 € (base I+D inflada a 450.000 €) a 11.746,07 €/año (I+D 30.000 × 20 % + aplicaciones 47.250 × 10 % + marca 210,72 × 10 %); (5) el flujo de caja del Excel se presenta como escenario proforma condicionado a concesión y desembolso de 180.000 €; la situación documental real mantiene financiación cobrada = 0 € y caja propia inicial = 0 €; (6) gasto histórico 1.058,31 € + 21,42 USD (incluida la tasa de marca 210,72 € en proceso), separado del presupuesto de F1; (7) envolvente CAPEX futura única prudente 5,14 / central 6,26 / techo 7,46 M€ (sin rangos paralelos).</w:t>
       </w:r>
     </w:p>
     <w:p>
@@ -44507,7 +44507,7 @@
         <w:pStyle w:val="3"/>
       </w:pPr>
       <w:r>
-        <w:t>Checks de reconciliación (memoria = Excel). F1 prudente 165.000 € · central 180.000 € · techo 195.000 € · caja propia inicial 0 € · ayudas en trámite 18.000 € + ≈2.700 € (no caja) · RCN 420.000 € (separado de caja) · gasto histórico 1.058,31 € + 21,42 USD · incidente malware 268,60 € · CAPEX visión central 6.260.000 € · Balance proforma matemáticamente cuadrado, pendiente de validación documental de financiación, aportaciones y obligaciones; no equivale al balance real de una sociedad constituida; la financiación sigue identificada como pendiente de formalización y no se considera caja propia · 0 errores en el Excel · amortización 9.746,07 €/año.</w:t>
+        <w:t>Checks de reconciliación (memoria = Excel). F1 prudente 165.000 € · central 180.000 € · techo 195.000 € · caja propia inicial 0 € · ayudas en trámite 18.000 € + ≈2.700 € (no caja) · RCN 420.000 € (separado de caja) · gasto histórico 1.058,31 € + 21,42 USD · incidente malware 268,60 € · CAPEX visión central 6.260.000 € · Balance proforma matemáticamente cuadrado, pendiente de validación documental de financiación, aportaciones y obligaciones; no equivale al balance real de una sociedad constituida; la financiación sigue identificada como pendiente de formalización y no se considera caja propia · 0 errores en el Excel · amortización 11.746,07 €/año.</w:t>
       </w:r>
     </w:p>
     <w:p>
@@ -48222,7 +48222,7 @@
                 <w:color w:val="1F2937"/>
                 <w:sz w:val="18"/>
               </w:rPr>
-              <w:t>10.704,50 €</w:t>
+              <w:t>10.696,00 €</w:t>
             </w:r>
           </w:p>
         </w:tc>
@@ -48278,7 +48278,7 @@
                 <w:color w:val="1F2937"/>
                 <w:sz w:val="18"/>
               </w:rPr>
-              <w:t>14.188,17 €</w:t>
+              <w:t>11.916,67 €</w:t>
             </w:r>
           </w:p>
         </w:tc>
@@ -48334,7 +48334,7 @@
                 <w:color w:val="1F2937"/>
                 <w:sz w:val="18"/>
               </w:rPr>
-              <w:t>3.105,67 €</w:t>
+              <w:t>2.566,67 €</w:t>
             </w:r>
           </w:p>
         </w:tc>
@@ -48390,7 +48390,7 @@
                 <w:color w:val="1F2937"/>
                 <w:sz w:val="18"/>
               </w:rPr>
-              <w:t>9.746,07 €</w:t>
+              <w:t>11.746,07 €</w:t>
             </w:r>
           </w:p>
         </w:tc>
@@ -48446,7 +48446,7 @@
                 <w:color w:val="1F2937"/>
                 <w:sz w:val="18"/>
               </w:rPr>
-              <w:t>−50.000,57 €</w:t>
+              <w:t>−75.762,67 €</w:t>
             </w:r>
           </w:p>
         </w:tc>
@@ -48558,7 +48558,7 @@
                 <w:color w:val="1F2937"/>
                 <w:sz w:val="18"/>
               </w:rPr>
-              <w:t>−62.600,57 €</w:t>
+              <w:t>−82.362,67 €</w:t>
             </w:r>
           </w:p>
         </w:tc>
@@ -49421,7 +49421,7 @@
                 <w:color w:val="1F2937"/>
                 <w:sz w:val="18"/>
               </w:rPr>
-              <w:t>9.746,07 €</w:t>
+              <w:t>11.746,07 €</w:t>
             </w:r>
           </w:p>
         </w:tc>
@@ -49439,7 +49439,7 @@
                 <w:color w:val="1F2937"/>
                 <w:sz w:val="18"/>
               </w:rPr>
-              <w:t>9.746,07 €</w:t>
+              <w:t>11.746,07 €</w:t>
             </w:r>
           </w:p>
         </w:tc>
@@ -49495,7 +49495,7 @@
                 <w:color w:val="1F2937"/>
                 <w:sz w:val="18"/>
               </w:rPr>
-              <w:t>−50.000,57 €</w:t>
+              <w:t>−75.762,67 €</w:t>
             </w:r>
           </w:p>
         </w:tc>
@@ -49513,7 +49513,7 @@
                 <w:color w:val="1F2937"/>
                 <w:sz w:val="18"/>
               </w:rPr>
-              <w:t>−50.000,57 €</w:t>
+              <w:t>−75.762,67 €</w:t>
             </w:r>
           </w:p>
         </w:tc>
@@ -49569,7 +49569,7 @@
                 <w:color w:val="1F2937"/>
                 <w:sz w:val="18"/>
               </w:rPr>
-              <w:t>−62.600,57 €</w:t>
+              <w:t>−82.362,67 €</w:t>
             </w:r>
           </w:p>
         </w:tc>
@@ -49587,7 +49587,7 @@
                 <w:color w:val="1F2937"/>
                 <w:sz w:val="18"/>
               </w:rPr>
-              <w:t>−62.600,57 €</w:t>
+              <w:t>−82.362,67 €</w:t>
             </w:r>
           </w:p>
         </w:tc>
@@ -50640,7 +50640,7 @@
                 <w:color w:val="1F2937"/>
                 <w:sz w:val="18"/>
               </w:rPr>
-              <w:t>10.704,50 €</w:t>
+              <w:t>10.696,00 €</w:t>
             </w:r>
           </w:p>
         </w:tc>
@@ -50764,7 +50764,7 @@
                 <w:color w:val="1F2937"/>
                 <w:sz w:val="18"/>
               </w:rPr>
-              <w:t>−50.000,57 €</w:t>
+              <w:t>−75.762,67 €</w:t>
             </w:r>
           </w:p>
         </w:tc>
@@ -50826,7 +50826,7 @@
                 <w:color w:val="1F2937"/>
                 <w:sz w:val="18"/>
               </w:rPr>
-              <w:t>−62.600,57 €</w:t>
+              <w:t>−82.362,67 €</w:t>
             </w:r>
           </w:p>
         </w:tc>
@@ -57089,6 +57089,17 @@
         </w:tc>
       </w:tr>
     </w:tbl>
+    <w:p>
+      <w:r>
+        <w:rPr>
+          <w:b/>
+        </w:rPr>
+        <w:t xml:space="preserve">CONTROL DE RECONCILIACIÓN V5.6.2. </w:t>
+      </w:r>
+      <w:r>
+        <w:t>Las cifras oficiales de ingresos, consumos, resultado de explotación, resultado antes de impuestos y puntos de equilibrio utilizadas en esta memoria deben coincidir con el libro financiero oficial recalculado. La financiación central de 180.000 € sigue siendo condicionada y no equivale a caja disponible.</w:t>
+      </w:r>
+    </w:p>
     <w:sectPr>
       <w:footerReference w:type="default" r:id="rId10"/>
       <w:cols w:space="720" w:num="1"/>

</xml_diff>